<commit_message>
Updated code for RBA-1091
</commit_message>
<xml_diff>
--- a/ReportTemplate/VendorContract.docx
+++ b/ReportTemplate/VendorContract.docx
@@ -9,7 +9,6 @@
       <w:r>
         <w:t>This VENDOR CONTRACT (</w:t>
       </w:r>
-      <w:proofErr w:type="spellStart"/>
       <w:sdt>
         <w:sdtPr>
           <w:alias w:val="#Nav: /Vendor_Contract/Contract_ID"/>
@@ -25,7 +24,6 @@
           <w:r>
             <w:t>Contract_ID</w:t>
           </w:r>
-          <w:proofErr w:type="spellEnd"/>
         </w:sdtContent>
       </w:sdt>
       <w:r>
@@ -37,7 +35,7 @@
           <w:placeholder>
             <w:docPart w:val="DefaultPlaceholder_-1854013440"/>
           </w:placeholder>
-          <w15:dataBinding w:prefixMappings="xmlns:ns0='urn:microsoft-dynamics-nav/reports/Vendor_Contract/53751/' " w:xpath="/ns0:NavWordReportXmlPart[1]/ns0:Vendor_Contract[1]/ns0:Day[1]" w:storeItemID="{08D28C89-14E3-4377-ADB6-0070883318FA}" w16sdtdh:storeItemChecksum="hZVpWQ=="/>
+          <w15:dataBinding w:prefixMappings="xmlns:ns0='urn:microsoft-dynamics-nav/reports/Vendor_Contract/53751/' " w:xpath="/ns0:NavWordReportXmlPart[1]/ns0:Vendor_Contract[1]/ns0:Day[1]" w:storeItemID="{08D28C89-14E3-4377-ADB6-0070883318FA}" w16sdtdh:storeItemChecksum="YF7YYQ=="/>
         </w:sdtPr>
         <w:sdtContent>
           <w:r>
@@ -46,15 +44,7 @@
         </w:sdtContent>
       </w:sdt>
       <w:r>
-        <w:t xml:space="preserve"> </w:t>
-      </w:r>
-      <w:proofErr w:type="spellStart"/>
-      <w:r>
-        <w:t>day</w:t>
-      </w:r>
-      <w:proofErr w:type="spellEnd"/>
-      <w:r>
-        <w:t xml:space="preserve"> of </w:t>
+        <w:t xml:space="preserve"> day of </w:t>
       </w:r>
       <w:sdt>
         <w:sdtPr>
@@ -62,7 +52,7 @@
           <w:placeholder>
             <w:docPart w:val="DefaultPlaceholder_-1854013440"/>
           </w:placeholder>
-          <w15:dataBinding w:prefixMappings="xmlns:ns0='urn:microsoft-dynamics-nav/reports/Vendor_Contract/53751/' " w:xpath="/ns0:NavWordReportXmlPart[1]/ns0:Vendor_Contract[1]/ns0:Month[1]" w:storeItemID="{08D28C89-14E3-4377-ADB6-0070883318FA}" w16sdtdh:storeItemChecksum="hZVpWQ=="/>
+          <w15:dataBinding w:prefixMappings="xmlns:ns0='urn:microsoft-dynamics-nav/reports/Vendor_Contract/53751/' " w:xpath="/ns0:NavWordReportXmlPart[1]/ns0:Vendor_Contract[1]/ns0:Month[1]" w:storeItemID="{08D28C89-14E3-4377-ADB6-0070883318FA}" w16sdtdh:storeItemChecksum="YF7YYQ=="/>
         </w:sdtPr>
         <w:sdtContent>
           <w:r>
@@ -79,7 +69,7 @@
           <w:placeholder>
             <w:docPart w:val="DefaultPlaceholder_-1854013440"/>
           </w:placeholder>
-          <w15:dataBinding w:prefixMappings="xmlns:ns0='urn:microsoft-dynamics-nav/reports/Vendor_Contract/53751/' " w:xpath="/ns0:NavWordReportXmlPart[1]/ns0:Vendor_Contract[1]/ns0:Year[1]" w:storeItemID="{08D28C89-14E3-4377-ADB6-0070883318FA}" w16sdtdh:storeItemChecksum="hZVpWQ=="/>
+          <w15:dataBinding w:prefixMappings="xmlns:ns0='urn:microsoft-dynamics-nav/reports/Vendor_Contract/53751/' " w:xpath="/ns0:NavWordReportXmlPart[1]/ns0:Vendor_Contract[1]/ns0:Year[1]" w:storeItemID="{08D28C89-14E3-4377-ADB6-0070883318FA}" w16sdtdh:storeItemChecksum="YF7YYQ=="/>
         </w:sdtPr>
         <w:sdtContent>
           <w:r>
@@ -111,11 +101,9 @@
           <w:text/>
         </w:sdtPr>
         <w:sdtContent>
-          <w:proofErr w:type="spellStart"/>
           <w:r>
             <w:t>CompanyName</w:t>
           </w:r>
-          <w:proofErr w:type="spellEnd"/>
         </w:sdtContent>
       </w:sdt>
       <w:r>
@@ -140,15 +128,16 @@
           <w:text/>
         </w:sdtPr>
         <w:sdtContent>
-          <w:proofErr w:type="spellStart"/>
           <w:r>
             <w:t>CompanyAddress</w:t>
           </w:r>
-          <w:proofErr w:type="spellEnd"/>
         </w:sdtContent>
       </w:sdt>
       <w:r>
         <w:t>,</w:t>
+      </w:r>
+      <w:r>
+        <w:t xml:space="preserve"> UAE</w:t>
       </w:r>
     </w:p>
     <w:p>
@@ -179,11 +168,9 @@
           <w:text/>
         </w:sdtPr>
         <w:sdtContent>
-          <w:proofErr w:type="spellStart"/>
           <w:r>
             <w:t>Vendor_Name</w:t>
           </w:r>
-          <w:proofErr w:type="spellEnd"/>
         </w:sdtContent>
       </w:sdt>
       <w:r>
@@ -208,11 +195,9 @@
           <w:text/>
         </w:sdtPr>
         <w:sdtContent>
-          <w:proofErr w:type="spellStart"/>
           <w:r>
             <w:t>VendorCountry</w:t>
           </w:r>
-          <w:proofErr w:type="spellEnd"/>
         </w:sdtContent>
       </w:sdt>
       <w:r>
@@ -237,11 +222,9 @@
           <w:text/>
         </w:sdtPr>
         <w:sdtContent>
-          <w:proofErr w:type="spellStart"/>
           <w:r>
             <w:t>VendorAddess</w:t>
           </w:r>
-          <w:proofErr w:type="spellEnd"/>
         </w:sdtContent>
       </w:sdt>
       <w:r>
@@ -281,11 +264,9 @@
           <w:text/>
         </w:sdtPr>
         <w:sdtContent>
-          <w:proofErr w:type="spellStart"/>
           <w:r>
             <w:t>ProjectName</w:t>
           </w:r>
-          <w:proofErr w:type="spellEnd"/>
         </w:sdtContent>
       </w:sdt>
       <w:r>
@@ -313,11 +294,9 @@
           <w:text/>
         </w:sdtPr>
         <w:sdtContent>
-          <w:proofErr w:type="spellStart"/>
           <w:r>
             <w:t>ProjectLocation</w:t>
           </w:r>
-          <w:proofErr w:type="spellEnd"/>
         </w:sdtContent>
       </w:sdt>
       <w:r>
@@ -411,14 +390,14 @@
       </w:r>
       <w:sdt>
         <w:sdtPr>
+          <w:alias w:val="#Nav: /Vendor_Contract/Description"/>
+          <w:tag w:val="#Nav: Vendor_Contract/53751"/>
           <w:id w:val="-880554077"/>
           <w:placeholder>
             <w:docPart w:val="DefaultPlaceholder_-1854013440"/>
           </w:placeholder>
           <w:dataBinding w:prefixMappings="xmlns:ns0='urn:microsoft-dynamics-nav/reports/Vendor_Contract/53751/'" w:xpath="/ns0:NavWordReportXmlPart[1]/ns0:Vendor_Contract[1]/ns0:Description[1]" w:storeItemID="{08D28C89-14E3-4377-ADB6-0070883318FA}"/>
           <w:text/>
-          <w:alias w:val="#Nav: /Vendor_Contract/Description"/>
-          <w:tag w:val="#Nav: Vendor_Contract/53751"/>
         </w:sdtPr>
         <w:sdtContent>
           <w:r>
@@ -480,17 +459,16 @@
             <w:b w:val="0"/>
             <w:bCs w:val="0"/>
           </w:rPr>
+          <w:alias w:val="#Nav: /Vendor_Contract/Delivery_Location"/>
+          <w:tag w:val="#Nav: Vendor_Contract/53751"/>
           <w:id w:val="-1217887589"/>
           <w:placeholder>
             <w:docPart w:val="DefaultPlaceholder_-1854013440"/>
           </w:placeholder>
           <w:dataBinding w:prefixMappings="xmlns:ns0='urn:microsoft-dynamics-nav/reports/Vendor_Contract/53751/'" w:xpath="/ns0:NavWordReportXmlPart[1]/ns0:Vendor_Contract[1]/ns0:Delivery_Location[1]" w:storeItemID="{08D28C89-14E3-4377-ADB6-0070883318FA}"/>
           <w:text/>
-          <w:alias w:val="#Nav: /Vendor_Contract/Delivery_Location"/>
-          <w:tag w:val="#Nav: Vendor_Contract/53751"/>
         </w:sdtPr>
         <w:sdtContent>
-          <w:proofErr w:type="spellStart"/>
           <w:r>
             <w:rPr>
               <w:b w:val="0"/>
@@ -498,7 +476,6 @@
             </w:rPr>
             <w:t>Delivery_Location</w:t>
           </w:r>
-          <w:proofErr w:type="spellEnd"/>
         </w:sdtContent>
       </w:sdt>
     </w:p>
@@ -513,13 +490,31 @@
       <w:r>
         <w:t xml:space="preserve">Delivery Date: </w:t>
       </w:r>
-      <w:r>
-        <w:rPr>
-          <w:b w:val="0"/>
-          <w:bCs w:val="0"/>
-        </w:rPr>
-        <w:t>Specify deadline or phased delivery schedule</w:t>
-      </w:r>
+      <w:sdt>
+        <w:sdtPr>
+          <w:rPr>
+            <w:b w:val="0"/>
+            <w:bCs w:val="0"/>
+          </w:rPr>
+          <w:alias w:val="#Nav: /Vendor_Contract/Delivery_Date"/>
+          <w:tag w:val="#Nav: Vendor_Contract/53751"/>
+          <w:id w:val="-884412642"/>
+          <w:placeholder>
+            <w:docPart w:val="DefaultPlaceholder_-1854013440"/>
+          </w:placeholder>
+          <w:dataBinding w:prefixMappings="xmlns:ns0='urn:microsoft-dynamics-nav/reports/Vendor_Contract/53751/'" w:xpath="/ns0:NavWordReportXmlPart[1]/ns0:Vendor_Contract[1]/ns0:Delivery_Date[1]" w:storeItemID="{08D28C89-14E3-4377-ADB6-0070883318FA}"/>
+          <w:text/>
+        </w:sdtPr>
+        <w:sdtContent>
+          <w:r>
+            <w:rPr>
+              <w:b w:val="0"/>
+              <w:bCs w:val="0"/>
+            </w:rPr>
+            <w:t>Delivery_Date</w:t>
+          </w:r>
+        </w:sdtContent>
+      </w:sdt>
     </w:p>
     <w:p>
       <w:pPr>
@@ -589,7 +584,6 @@
           <w:text/>
         </w:sdtPr>
         <w:sdtContent>
-          <w:proofErr w:type="spellStart"/>
           <w:r>
             <w:rPr>
               <w:b w:val="0"/>
@@ -597,7 +591,6 @@
             </w:rPr>
             <w:t>PenaltyClauses</w:t>
           </w:r>
-          <w:proofErr w:type="spellEnd"/>
         </w:sdtContent>
       </w:sdt>
     </w:p>
@@ -651,7 +644,6 @@
           <w:text/>
         </w:sdtPr>
         <w:sdtContent>
-          <w:proofErr w:type="spellStart"/>
           <w:r>
             <w:rPr>
               <w:b w:val="0"/>
@@ -659,7 +651,6 @@
             </w:rPr>
             <w:t>Contract_Amount</w:t>
           </w:r>
-          <w:proofErr w:type="spellEnd"/>
         </w:sdtContent>
       </w:sdt>
       <w:r>
@@ -703,17 +694,16 @@
             <w:b w:val="0"/>
             <w:bCs w:val="0"/>
           </w:rPr>
+          <w:alias w:val="#Nav: /Vendor_Contract/Advance_Payment"/>
+          <w:tag w:val="#Nav: Vendor_Contract/53751"/>
           <w:id w:val="1412971333"/>
           <w:placeholder>
             <w:docPart w:val="DefaultPlaceholder_-1854013440"/>
           </w:placeholder>
           <w:dataBinding w:prefixMappings="xmlns:ns0='urn:microsoft-dynamics-nav/reports/Vendor_Contract/53751/'" w:xpath="/ns0:NavWordReportXmlPart[1]/ns0:Vendor_Contract[1]/ns0:Advance_Payment[1]" w:storeItemID="{08D28C89-14E3-4377-ADB6-0070883318FA}"/>
           <w:text/>
-          <w:alias w:val="#Nav: /Vendor_Contract/Advance_Payment"/>
-          <w:tag w:val="#Nav: Vendor_Contract/53751"/>
         </w:sdtPr>
         <w:sdtContent>
-          <w:proofErr w:type="spellStart"/>
           <w:r>
             <w:rPr>
               <w:b w:val="0"/>
@@ -721,7 +711,6 @@
             </w:rPr>
             <w:t>Advance_Payment</w:t>
           </w:r>
-          <w:proofErr w:type="spellEnd"/>
         </w:sdtContent>
       </w:sdt>
       <w:r>
@@ -753,17 +742,16 @@
             <w:b w:val="0"/>
             <w:bCs w:val="0"/>
           </w:rPr>
+          <w:alias w:val="#Nav: /Vendor_Contract/Interim_Payment"/>
+          <w:tag w:val="#Nav: Vendor_Contract/53751"/>
           <w:id w:val="-600949480"/>
           <w:placeholder>
             <w:docPart w:val="DefaultPlaceholder_-1854013440"/>
           </w:placeholder>
           <w:dataBinding w:prefixMappings="xmlns:ns0='urn:microsoft-dynamics-nav/reports/Vendor_Contract/53751/'" w:xpath="/ns0:NavWordReportXmlPart[1]/ns0:Vendor_Contract[1]/ns0:Interim_Payment[1]" w:storeItemID="{08D28C89-14E3-4377-ADB6-0070883318FA}"/>
           <w:text/>
-          <w:alias w:val="#Nav: /Vendor_Contract/Interim_Payment"/>
-          <w:tag w:val="#Nav: Vendor_Contract/53751"/>
         </w:sdtPr>
         <w:sdtContent>
-          <w:proofErr w:type="spellStart"/>
           <w:r>
             <w:rPr>
               <w:b w:val="0"/>
@@ -771,7 +759,6 @@
             </w:rPr>
             <w:t>Interim_Payment</w:t>
           </w:r>
-          <w:proofErr w:type="spellEnd"/>
         </w:sdtContent>
       </w:sdt>
       <w:r>
@@ -813,17 +800,16 @@
             <w:b w:val="0"/>
             <w:bCs w:val="0"/>
           </w:rPr>
+          <w:alias w:val="#Nav: /Vendor_Contract/Final_Payment"/>
+          <w:tag w:val="#Nav: Vendor_Contract/53751"/>
           <w:id w:val="630598905"/>
           <w:placeholder>
             <w:docPart w:val="DefaultPlaceholder_-1854013440"/>
           </w:placeholder>
           <w:dataBinding w:prefixMappings="xmlns:ns0='urn:microsoft-dynamics-nav/reports/Vendor_Contract/53751/'" w:xpath="/ns0:NavWordReportXmlPart[1]/ns0:Vendor_Contract[1]/ns0:Final_Payment[1]" w:storeItemID="{08D28C89-14E3-4377-ADB6-0070883318FA}"/>
           <w:text/>
-          <w:alias w:val="#Nav: /Vendor_Contract/Final_Payment"/>
-          <w:tag w:val="#Nav: Vendor_Contract/53751"/>
         </w:sdtPr>
         <w:sdtContent>
-          <w:proofErr w:type="spellStart"/>
           <w:r>
             <w:rPr>
               <w:b w:val="0"/>
@@ -831,7 +817,6 @@
             </w:rPr>
             <w:t>Final_Payment</w:t>
           </w:r>
-          <w:proofErr w:type="spellEnd"/>
         </w:sdtContent>
       </w:sdt>
       <w:r>
@@ -897,7 +882,6 @@
           <w:text/>
         </w:sdtPr>
         <w:sdtContent>
-          <w:proofErr w:type="spellStart"/>
           <w:r>
             <w:rPr>
               <w:b w:val="0"/>
@@ -905,7 +889,6 @@
             </w:rPr>
             <w:t>Payment_Method</w:t>
           </w:r>
-          <w:proofErr w:type="spellEnd"/>
         </w:sdtContent>
       </w:sdt>
     </w:p>
@@ -961,11 +944,9 @@
             </w:numPr>
             <w:jc w:val="both"/>
           </w:pPr>
-          <w:proofErr w:type="spellStart"/>
           <w:r>
             <w:t>UAE_Compliance_Requirements</w:t>
           </w:r>
-          <w:proofErr w:type="spellEnd"/>
         </w:p>
       </w:sdtContent>
     </w:sdt>
@@ -989,11 +970,9 @@
             </w:numPr>
             <w:jc w:val="both"/>
           </w:pPr>
-          <w:proofErr w:type="spellStart"/>
           <w:r>
             <w:t>Industry_Standards</w:t>
           </w:r>
-          <w:proofErr w:type="spellEnd"/>
         </w:p>
       </w:sdtContent>
     </w:sdt>
@@ -1102,23 +1081,18 @@
       </w:r>
       <w:sdt>
         <w:sdtPr>
+          <w:alias w:val="#Nav: /Vendor_Contract/Warranty_Period__Months_"/>
+          <w:tag w:val="#Nav: Vendor_Contract/53751"/>
           <w:id w:val="-1628469518"/>
           <w:placeholder>
             <w:docPart w:val="DefaultPlaceholder_-1854013440"/>
           </w:placeholder>
           <w:dataBinding w:prefixMappings="xmlns:ns0='urn:microsoft-dynamics-nav/reports/Vendor_Contract/53751/'" w:xpath="/ns0:NavWordReportXmlPart[1]/ns0:Vendor_Contract[1]/ns0:Warranty_Period__Months_[1]" w:storeItemID="{08D28C89-14E3-4377-ADB6-0070883318FA}"/>
           <w:text/>
-          <w:alias w:val="#Nav: /Vendor_Contract/Warranty_Period__Months_"/>
-          <w:tag w:val="#Nav: Vendor_Contract/53751"/>
         </w:sdtPr>
         <w:sdtContent>
-          <w:proofErr w:type="spellStart"/>
           <w:r>
-            <w:t>Warranty_Period__Months</w:t>
-          </w:r>
-          <w:proofErr w:type="spellEnd"/>
-          <w:r>
-            <w:t>_</w:t>
+            <w:t>Warranty_Period__Months_</w:t>
           </w:r>
         </w:sdtContent>
       </w:sdt>
@@ -1411,7 +1385,6 @@
           <w:text/>
         </w:sdtPr>
         <w:sdtContent>
-          <w:proofErr w:type="spellStart"/>
           <w:r>
             <w:rPr>
               <w:b w:val="0"/>
@@ -1419,7 +1392,6 @@
             </w:rPr>
             <w:t>Dispute_Resolution</w:t>
           </w:r>
-          <w:proofErr w:type="spellEnd"/>
         </w:sdtContent>
       </w:sdt>
     </w:p>
@@ -1591,11 +1563,9 @@
           <w:text/>
         </w:sdtPr>
         <w:sdtContent>
-          <w:proofErr w:type="spellStart"/>
           <w:r>
             <w:t>CompanyName</w:t>
           </w:r>
-          <w:proofErr w:type="spellEnd"/>
         </w:sdtContent>
       </w:sdt>
     </w:p>
@@ -1639,11 +1609,9 @@
           <w:text/>
         </w:sdtPr>
         <w:sdtContent>
-          <w:proofErr w:type="spellStart"/>
           <w:r>
             <w:t>Vendor_Name</w:t>
           </w:r>
-          <w:proofErr w:type="spellEnd"/>
         </w:sdtContent>
       </w:sdt>
     </w:p>
@@ -1718,7 +1686,6 @@
           <w:text/>
         </w:sdtPr>
         <w:sdtContent>
-          <w:proofErr w:type="spellStart"/>
           <w:r>
             <w:rPr>
               <w:b w:val="0"/>
@@ -1726,7 +1693,6 @@
             </w:rPr>
             <w:t>Work_Scope</w:t>
           </w:r>
-          <w:proofErr w:type="spellEnd"/>
         </w:sdtContent>
       </w:sdt>
     </w:p>
@@ -1771,14 +1737,22 @@
       <w:tblPr>
         <w:tblStyle w:val="TableGrid"/>
         <w:tblW w:w="0" w:type="auto"/>
+        <w:tblBorders>
+          <w:top w:val="none" w:color="auto" w:sz="0" w:space="0"/>
+          <w:left w:val="none" w:color="auto" w:sz="0" w:space="0"/>
+          <w:bottom w:val="none" w:color="auto" w:sz="0" w:space="0"/>
+          <w:right w:val="none" w:color="auto" w:sz="0" w:space="0"/>
+          <w:insideH w:val="none" w:color="auto" w:sz="0" w:space="0"/>
+          <w:insideV w:val="none" w:color="auto" w:sz="0" w:space="0"/>
+        </w:tblBorders>
         <w:tblLook w:val="04A0" w:firstRow="1" w:lastRow="0" w:firstColumn="1" w:lastColumn="0" w:noHBand="0" w:noVBand="1"/>
       </w:tblPr>
       <w:tblGrid>
-        <w:gridCol w:w="3483"/>
+        <w:gridCol w:w="3489"/>
         <w:gridCol w:w="1079"/>
-        <w:gridCol w:w="1519"/>
+        <w:gridCol w:w="1522"/>
         <w:gridCol w:w="1478"/>
-        <w:gridCol w:w="1457"/>
+        <w:gridCol w:w="1458"/>
       </w:tblGrid>
       <w:tr>
         <w:tc>
@@ -1956,7 +1930,6 @@
                             <w:szCs w:val="20"/>
                           </w:rPr>
                         </w:pPr>
-                        <w:proofErr w:type="spellStart"/>
                         <w:r>
                           <w:rPr>
                             <w:b w:val="0"/>
@@ -1966,7 +1939,6 @@
                           </w:rPr>
                           <w:t>Item_Description</w:t>
                         </w:r>
-                        <w:proofErr w:type="spellEnd"/>
                       </w:p>
                     </w:tc>
                   </w:sdtContent>
@@ -2040,6 +2012,7 @@
                       </w:tcPr>
                       <w:p>
                         <w:pPr>
+                          <w:jc w:val="center"/>
                           <w:rPr>
                             <w:b w:val="0"/>
                             <w:bCs w:val="0"/>
@@ -2092,7 +2065,6 @@
                             <w:szCs w:val="20"/>
                           </w:rPr>
                         </w:pPr>
-                        <w:proofErr w:type="spellStart"/>
                         <w:r>
                           <w:rPr>
                             <w:b w:val="0"/>
@@ -2102,7 +2074,6 @@
                           </w:rPr>
                           <w:t>Price_Per_Unit</w:t>
                         </w:r>
-                        <w:proofErr w:type="spellEnd"/>
                       </w:p>
                     </w:tc>
                   </w:sdtContent>
@@ -2139,7 +2110,6 @@
                             <w:szCs w:val="20"/>
                           </w:rPr>
                         </w:pPr>
-                        <w:proofErr w:type="spellStart"/>
                         <w:r>
                           <w:rPr>
                             <w:b w:val="0"/>
@@ -2149,7 +2119,6 @@
                           </w:rPr>
                           <w:t>Total_Cost</w:t>
                         </w:r>
-                        <w:proofErr w:type="spellEnd"/>
                       </w:p>
                     </w:tc>
                   </w:sdtContent>
@@ -4453,6 +4422,13 @@
     <w:pitch w:val="variable"/>
     <w:sig w:usb0="E4002EFF" w:usb1="C200247B" w:usb2="00000009" w:usb3="00000000" w:csb0="000001FF" w:csb1="00000000"/>
   </w:font>
+  <w:font w:name="Arial">
+    <w:panose1 w:val="020B0604020202020204"/>
+    <w:charset w:val="00"/>
+    <w:family w:val="swiss"/>
+    <w:pitch w:val="variable"/>
+    <w:sig w:usb0="E0002EFF" w:usb1="C000785B" w:usb2="00000009" w:usb3="00000000" w:csb0="000001FF" w:csb1="00000000"/>
+  </w:font>
 </w:fonts>
 </file>
 
@@ -4472,6 +4448,7 @@
   </w:compat>
   <w:rsids>
     <w:rsidRoot w:val="004844FC"/>
+    <w:rsid w:val="00107367"/>
     <w:rsid w:val="00192E30"/>
     <w:rsid w:val="001E74EA"/>
     <w:rsid w:val="002C2E09"/>
@@ -4481,9 +4458,13 @@
     <w:rsid w:val="0052082E"/>
     <w:rsid w:val="006C1F97"/>
     <w:rsid w:val="0072754F"/>
+    <w:rsid w:val="00885955"/>
     <w:rsid w:val="00897112"/>
     <w:rsid w:val="008E4622"/>
     <w:rsid w:val="009F3DA1"/>
+    <w:rsid w:val="00A351E3"/>
+    <w:rsid w:val="00B41945"/>
+    <w:rsid w:val="00B56DCC"/>
     <w:rsid w:val="00C7292D"/>
     <w:rsid w:val="00D86658"/>
     <w:rsid w:val="00DF5415"/>
@@ -4494,6 +4475,7 @@
     <w:rsid w:val="00F301F5"/>
     <w:rsid w:val="00F66482"/>
     <w:rsid w:val="00F75911"/>
+    <w:rsid w:val="00F97834"/>
   </w:rsids>
   <m:mathPr>
     <m:mathFont m:val="Cambria Math"/>
@@ -4508,7 +4490,7 @@
     <m:intLim m:val="subSup"/>
     <m:naryLim m:val="undOvr"/>
   </m:mathPr>
-  <w:themeFontLang w:val="en-US"/>
+  <w:themeFontLang w:val="en-US" w:bidi="ar-SA"/>
   <w:clrSchemeMapping w:bg1="light1" w:t1="dark1" w:bg2="light2" w:t2="dark2" w:accent1="accent1" w:accent2="accent2" w:accent3="accent3" w:accent4="accent4" w:accent5="accent5" w:accent6="accent6" w:hyperlink="hyperlink" w:followedHyperlink="followedHyperlink"/>
   <w:decimalSymbol w:val="."/>
   <w:listSeparator w:val=","/>
@@ -5259,7 +5241,11 @@
 </a:theme>
 </file>
 
-<file path=customXml/item1.xml>��< ? x m l   v e r s i o n = " 1 . 0 "   e n c o d i n g = " u t f - 1 6 " ? > < N a v W o r d R e p o r t X m l P a r t   x m l n s = " u r n : m i c r o s o f t - d y n a m i c s - n a v / r e p o r t s / V e n d o r _ C o n t r a c t / 5 3 7 5 1 / " > +<file path=customXml/item1.xml><?xml version="1.0" encoding="utf-8"?>
+<b:Sources xmlns:b="http://schemas.openxmlformats.org/officeDocument/2006/bibliography" xmlns="http://schemas.openxmlformats.org/officeDocument/2006/bibliography" SelectedStyle="\APASixthEditionOfficeOnline.xsl" StyleName="APA" Version="6"/>
+</file>
+
+<file path=customXml/item2.xml>��< ? x m l   v e r s i o n = " 1 . 0 "   e n c o d i n g = " u t f - 1 6 " ? > < N a v W o r d R e p o r t X m l P a r t   x m l n s = " u r n : m i c r o s o f t - d y n a m i c s - n a v / r e p o r t s / V e n d o r _ C o n t r a c t / 5 3 7 5 1 / " >   
      < B C R e p o r t I n f o r m a t i o n >   
@@ -5344,6 +5330,8 @@
          < C o n t r a c t _ S t a r t _ D a t e > C o n t r a c t _ S t a r t _ D a t e < / C o n t r a c t _ S t a r t _ D a t e >   
          < D a y > D a y < / D a y > + 
+         < D e l i v e r y _ D a t e > D e l i v e r y _ D a t e < / D e l i v e r y _ D a t e >   
          < D e l i v e r y _ L o c a t i o n > D e l i v e r y _ L o c a t i o n < / D e l i v e r y _ L o c a t i o n >   
@@ -5408,22 +5396,18 @@
  < / N a v W o r d R e p o r t X m l P a r t > 
 </file>
 
-<file path=customXml/item2.xml><?xml version="1.0" encoding="utf-8"?>
-<b:Sources xmlns:b="http://schemas.openxmlformats.org/officeDocument/2006/bibliography" xmlns="http://schemas.openxmlformats.org/officeDocument/2006/bibliography" SelectedStyle="\APASixthEditionOfficeOnline.xsl" StyleName="APA" Version="6"/>
+<file path=customXml/itemProps1.xml><?xml version="1.0" encoding="utf-8"?>
+<ds:datastoreItem xmlns:ds="http://schemas.openxmlformats.org/officeDocument/2006/customXml" ds:itemID="{F5E65CA3-67B9-4A03-A4DC-EA10B6566E8F}">
+  <ds:schemaRefs>
+    <ds:schemaRef ds:uri="http://schemas.openxmlformats.org/officeDocument/2006/bibliography"/>
+  </ds:schemaRefs>
+</ds:datastoreItem>
 </file>
 
-<file path=customXml/itemProps1.xml><?xml version="1.0" encoding="utf-8"?>
+<file path=customXml/itemProps2.xml><?xml version="1.0" encoding="utf-8"?>
 <ds:datastoreItem xmlns:ds="http://schemas.openxmlformats.org/officeDocument/2006/customXml" ds:itemID="{08D28C89-14E3-4377-ADB6-0070883318FA}">
   <ds:schemaRefs>
     <ds:schemaRef ds:uri="urn:microsoft-dynamics-nav/reports/Vendor_Contract/53751/"/>
   </ds:schemaRefs>
 </ds:datastoreItem>
-</file>
-
-<file path=customXml/itemProps2.xml><?xml version="1.0" encoding="utf-8"?>
-<ds:datastoreItem xmlns:ds="http://schemas.openxmlformats.org/officeDocument/2006/customXml" ds:itemID="{F5E65CA3-67B9-4A03-A4DC-EA10B6566E8F}">
-  <ds:schemaRefs>
-    <ds:schemaRef ds:uri="http://schemas.openxmlformats.org/officeDocument/2006/bibliography"/>
-  </ds:schemaRefs>
-</ds:datastoreItem>
 </file>
</xml_diff>